<commit_message>
Use held-out CAN test set for evaluation
</commit_message>
<xml_diff>
--- a/reports/CAN_Traffic_Anomaly_Detection_Report_TR.docx
+++ b/reports/CAN_Traffic_Anomaly_Detection_Report_TR.docx
@@ -16,7 +16,7 @@
         <w:jc w:val="center"/>
       </w:pPr>
       <w:r>
-        <w:t xml:space="preserve">Oluşturulma tarihi: 2026-05-20 11:59</w:t>
+        <w:t xml:space="preserve">Oluşturulma tarihi: 2026-05-20 13:03</w:t>
       </w:r>
     </w:p>
     <w:p>
@@ -106,7 +106,7 @@
     </w:p>
     <w:p>
       <w:r>
-        <w:t xml:space="preserve">- Değerlendirme: train/test ayrımı, stratified k-fold cross validation, accuracy, macro F1, precision ve recall.</w:t>
+        <w:t xml:space="preserve">- Değerlendirme: data/raw/train ile eğitim, data/raw/test ile bağımsız test, stratified k-fold cross validation, accuracy, macro F1, precision ve recall.</w:t>
       </w:r>
     </w:p>
     <w:p>
@@ -116,7 +116,7 @@
     </w:p>
     <w:p>
       <w:r>
-        <w:t xml:space="preserve">- Veri seti: 4593435 CAN mesajı, 143539 kayan pencere; pencere boyutu/adım: 64/32.</w:t>
+        <w:t xml:space="preserve">- Veri seti: train tarafında 4593435 CAN mesajı ve 143539 pencere; test tarafında 19996 CAN mesajı ve 620 pencere. Pencere boyutu/adım: 64/32.</w:t>
       </w:r>
     </w:p>
     <w:p>
@@ -129,7 +129,7 @@
     </w:p>
     <w:p>
       <w:r>
-        <w:t xml:space="preserve">Tüm denetimli modeller aynı özellik kümesi ve aynı değerlendirme metrikleriyle karşılaştırılmıştır. Aşağıdaki tablo test başarısını ve 5 katlı çapraz doğrulama sonucunu özetler.</w:t>
+        <w:t xml:space="preserve">Tüm denetimli modeller aynı özellik kümesi ve aynı değerlendirme metrikleriyle karşılaştırılmıştır. Modeller yalnızca data/raw/train klasöründen çıkarılan pencerelerle eğitilmiş, aşağıdaki test skorları data/raw/test klasöründeki bağımsız dosyalardan elde edilmiştir. 5 katlı çapraz doğrulama ise eğitim verisi üzerinde hesaplanmıştır.</w:t>
       </w:r>
     </w:p>
     <w:tbl>
@@ -208,37 +208,37 @@
           </w:tcPr>
           <w:p>
             <w:r>
-              <w:t xml:space="preserve">Random Forest</w:t>
-            </w:r>
-          </w:p>
-        </w:tc>
-        <w:tc>
-          <w:tcPr>
-            <w:tcW w:w="2400" w:type="dxa"/>
-          </w:tcPr>
-          <w:p>
-            <w:r>
-              <w:t xml:space="preserve">0.9989</w:t>
-            </w:r>
-          </w:p>
-        </w:tc>
-        <w:tc>
-          <w:tcPr>
-            <w:tcW w:w="2400" w:type="dxa"/>
-          </w:tcPr>
-          <w:p>
-            <w:r>
-              <w:t xml:space="preserve">0.9989</w:t>
-            </w:r>
-          </w:p>
-        </w:tc>
-        <w:tc>
-          <w:tcPr>
-            <w:tcW w:w="2400" w:type="dxa"/>
-          </w:tcPr>
-          <w:p>
-            <w:r>
-              <w:t xml:space="preserve">0.9983</w:t>
+              <w:t xml:space="preserve">Logistic Regression</w:t>
+            </w:r>
+          </w:p>
+        </w:tc>
+        <w:tc>
+          <w:tcPr>
+            <w:tcW w:w="2400" w:type="dxa"/>
+          </w:tcPr>
+          <w:p>
+            <w:r>
+              <w:t xml:space="preserve">1.0000</w:t>
+            </w:r>
+          </w:p>
+        </w:tc>
+        <w:tc>
+          <w:tcPr>
+            <w:tcW w:w="2400" w:type="dxa"/>
+          </w:tcPr>
+          <w:p>
+            <w:r>
+              <w:t xml:space="preserve">1.0000</w:t>
+            </w:r>
+          </w:p>
+        </w:tc>
+        <w:tc>
+          <w:tcPr>
+            <w:tcW w:w="2400" w:type="dxa"/>
+          </w:tcPr>
+          <w:p>
+            <w:r>
+              <w:t xml:space="preserve">0.9976</w:t>
             </w:r>
           </w:p>
         </w:tc>
@@ -250,37 +250,37 @@
           </w:tcPr>
           <w:p>
             <w:r>
-              <w:t xml:space="preserve">Linear SVM</w:t>
-            </w:r>
-          </w:p>
-        </w:tc>
-        <w:tc>
-          <w:tcPr>
-            <w:tcW w:w="2400" w:type="dxa"/>
-          </w:tcPr>
-          <w:p>
-            <w:r>
-              <w:t xml:space="preserve">0.9980</w:t>
-            </w:r>
-          </w:p>
-        </w:tc>
-        <w:tc>
-          <w:tcPr>
-            <w:tcW w:w="2400" w:type="dxa"/>
-          </w:tcPr>
-          <w:p>
-            <w:r>
-              <w:t xml:space="preserve">0.9980</w:t>
-            </w:r>
-          </w:p>
-        </w:tc>
-        <w:tc>
-          <w:tcPr>
-            <w:tcW w:w="2400" w:type="dxa"/>
-          </w:tcPr>
-          <w:p>
-            <w:r>
-              <w:t xml:space="preserve">0.9975</w:t>
+              <w:t xml:space="preserve">Random Forest</w:t>
+            </w:r>
+          </w:p>
+        </w:tc>
+        <w:tc>
+          <w:tcPr>
+            <w:tcW w:w="2400" w:type="dxa"/>
+          </w:tcPr>
+          <w:p>
+            <w:r>
+              <w:t xml:space="preserve">1.0000</w:t>
+            </w:r>
+          </w:p>
+        </w:tc>
+        <w:tc>
+          <w:tcPr>
+            <w:tcW w:w="2400" w:type="dxa"/>
+          </w:tcPr>
+          <w:p>
+            <w:r>
+              <w:t xml:space="preserve">1.0000</w:t>
+            </w:r>
+          </w:p>
+        </w:tc>
+        <w:tc>
+          <w:tcPr>
+            <w:tcW w:w="2400" w:type="dxa"/>
+          </w:tcPr>
+          <w:p>
+            <w:r>
+              <w:t xml:space="preserve">0.9985</w:t>
             </w:r>
           </w:p>
         </w:tc>
@@ -292,37 +292,37 @@
           </w:tcPr>
           <w:p>
             <w:r>
-              <w:t xml:space="preserve">Logistic Regression</w:t>
-            </w:r>
-          </w:p>
-        </w:tc>
-        <w:tc>
-          <w:tcPr>
-            <w:tcW w:w="2400" w:type="dxa"/>
-          </w:tcPr>
-          <w:p>
-            <w:r>
-              <w:t xml:space="preserve">0.9980</w:t>
-            </w:r>
-          </w:p>
-        </w:tc>
-        <w:tc>
-          <w:tcPr>
-            <w:tcW w:w="2400" w:type="dxa"/>
-          </w:tcPr>
-          <w:p>
-            <w:r>
-              <w:t xml:space="preserve">0.9980</w:t>
-            </w:r>
-          </w:p>
-        </w:tc>
-        <w:tc>
-          <w:tcPr>
-            <w:tcW w:w="2400" w:type="dxa"/>
-          </w:tcPr>
-          <w:p>
-            <w:r>
-              <w:t xml:space="preserve">0.9974</w:t>
+              <w:t xml:space="preserve">Linear SVM</w:t>
+            </w:r>
+          </w:p>
+        </w:tc>
+        <w:tc>
+          <w:tcPr>
+            <w:tcW w:w="2400" w:type="dxa"/>
+          </w:tcPr>
+          <w:p>
+            <w:r>
+              <w:t xml:space="preserve">0.9984</w:t>
+            </w:r>
+          </w:p>
+        </w:tc>
+        <w:tc>
+          <w:tcPr>
+            <w:tcW w:w="2400" w:type="dxa"/>
+          </w:tcPr>
+          <w:p>
+            <w:r>
+              <w:t xml:space="preserve">0.9984</w:t>
+            </w:r>
+          </w:p>
+        </w:tc>
+        <w:tc>
+          <w:tcPr>
+            <w:tcW w:w="2400" w:type="dxa"/>
+          </w:tcPr>
+          <w:p>
+            <w:r>
+              <w:t xml:space="preserve">0.9977</w:t>
             </w:r>
           </w:p>
         </w:tc>
@@ -334,37 +334,37 @@
           </w:tcPr>
           <w:p>
             <w:r>
-              <w:t xml:space="preserve">KNN</w:t>
-            </w:r>
-          </w:p>
-        </w:tc>
-        <w:tc>
-          <w:tcPr>
-            <w:tcW w:w="2400" w:type="dxa"/>
-          </w:tcPr>
-          <w:p>
-            <w:r>
-              <w:t xml:space="preserve">0.9976</w:t>
-            </w:r>
-          </w:p>
-        </w:tc>
-        <w:tc>
-          <w:tcPr>
-            <w:tcW w:w="2400" w:type="dxa"/>
-          </w:tcPr>
-          <w:p>
-            <w:r>
-              <w:t xml:space="preserve">0.9976</w:t>
-            </w:r>
-          </w:p>
-        </w:tc>
-        <w:tc>
-          <w:tcPr>
-            <w:tcW w:w="2400" w:type="dxa"/>
-          </w:tcPr>
-          <w:p>
-            <w:r>
-              <w:t xml:space="preserve">0.9965</w:t>
+              <w:t xml:space="preserve">Decision Tree</w:t>
+            </w:r>
+          </w:p>
+        </w:tc>
+        <w:tc>
+          <w:tcPr>
+            <w:tcW w:w="2400" w:type="dxa"/>
+          </w:tcPr>
+          <w:p>
+            <w:r>
+              <w:t xml:space="preserve">0.9984</w:t>
+            </w:r>
+          </w:p>
+        </w:tc>
+        <w:tc>
+          <w:tcPr>
+            <w:tcW w:w="2400" w:type="dxa"/>
+          </w:tcPr>
+          <w:p>
+            <w:r>
+              <w:t xml:space="preserve">0.9984</w:t>
+            </w:r>
+          </w:p>
+        </w:tc>
+        <w:tc>
+          <w:tcPr>
+            <w:tcW w:w="2400" w:type="dxa"/>
+          </w:tcPr>
+          <w:p>
+            <w:r>
+              <w:t xml:space="preserve">0.9963</w:t>
             </w:r>
           </w:p>
         </w:tc>
@@ -376,37 +376,37 @@
           </w:tcPr>
           <w:p>
             <w:r>
-              <w:t xml:space="preserve">Decision Tree</w:t>
-            </w:r>
-          </w:p>
-        </w:tc>
-        <w:tc>
-          <w:tcPr>
-            <w:tcW w:w="2400" w:type="dxa"/>
-          </w:tcPr>
-          <w:p>
-            <w:r>
-              <w:t xml:space="preserve">0.9965</w:t>
-            </w:r>
-          </w:p>
-        </w:tc>
-        <w:tc>
-          <w:tcPr>
-            <w:tcW w:w="2400" w:type="dxa"/>
-          </w:tcPr>
-          <w:p>
-            <w:r>
-              <w:t xml:space="preserve">0.9965</w:t>
-            </w:r>
-          </w:p>
-        </w:tc>
-        <w:tc>
-          <w:tcPr>
-            <w:tcW w:w="2400" w:type="dxa"/>
-          </w:tcPr>
-          <w:p>
-            <w:r>
-              <w:t xml:space="preserve">0.9957</w:t>
+              <w:t xml:space="preserve">KNN</w:t>
+            </w:r>
+          </w:p>
+        </w:tc>
+        <w:tc>
+          <w:tcPr>
+            <w:tcW w:w="2400" w:type="dxa"/>
+          </w:tcPr>
+          <w:p>
+            <w:r>
+              <w:t xml:space="preserve">0.9968</w:t>
+            </w:r>
+          </w:p>
+        </w:tc>
+        <w:tc>
+          <w:tcPr>
+            <w:tcW w:w="2400" w:type="dxa"/>
+          </w:tcPr>
+          <w:p>
+            <w:r>
+              <w:t xml:space="preserve">0.9968</w:t>
+            </w:r>
+          </w:p>
+        </w:tc>
+        <w:tc>
+          <w:tcPr>
+            <w:tcW w:w="2400" w:type="dxa"/>
+          </w:tcPr>
+          <w:p>
+            <w:r>
+              <w:t xml:space="preserve">0.9966</w:t>
             </w:r>
           </w:p>
         </w:tc>
@@ -414,7 +414,7 @@
     </w:tbl>
     <w:p>
       <w:r>
-        <w:t xml:space="preserve">En iyi sonuç Random Forest modeliyle elde edilmiştir. Test macro F1 skoru 0.9989 olduğundan uygulamadaki varsayılan dedektör bu modeldir.</w:t>
+        <w:t xml:space="preserve">En iyi sonuç Logistic Regression modeliyle elde edilmiştir. Bağımsız test macro F1 skoru 1.0000 olduğundan uygulamadaki varsayılan dedektör bu modeldir.</w:t>
       </w:r>
     </w:p>
     <w:p>
@@ -424,7 +424,7 @@
     </w:p>
     <w:p>
       <w:r>
-        <w:t xml:space="preserve">Confusion matrix ve PCA/K-Means görselleri React arayüzünde ve outputs/experiments klasöründe üretilmektedir. Bağımsız test dosyalarında normal trafik temiz, DoS/Fuzzy/Impersonation dosyaları ise doğru saldırı tipiyle şüpheli olarak işaretlenmiştir. Sınırlılık olarak sistem canlı araç akışını değil, CSV dosyalarını analiz eder.</w:t>
+        <w:t xml:space="preserve">Confusion matrix ve PCA/K-Means görselleri React arayüzünde ve outputs/experiments klasöründe üretilmektedir. Bağımsız test dosyaları eğitimde kullanılmadığı için raporlanan metrikler modelin ayrılmış test verisindeki genelleme başarısını gösterir. Sınırlılık olarak sistem canlı araç akışını değil, CSV dosyalarını analiz eder.</w:t>
       </w:r>
     </w:p>
     <w:p>
@@ -465,7 +465,7 @@
     </w:p>
     <w:p>
       <w:r>
-        <w:t xml:space="preserve">- Dosya bazlı veya araç bazlı farklı train/test ayrımlarıyla genelleme başarısı ayrıca ölçülebilir.</w:t>
+        <w:t xml:space="preserve">- Farklı araçlardan toplanmış daha çeşitli dış test setleriyle genelleme başarısı ayrıca ölçülebilir.</w:t>
       </w:r>
     </w:p>
     <w:p>

</xml_diff>